<commit_message>
Round 14c: authorised figure label edits, Table 4 evidence eTable, disclosures
WP-A3 (GPT-6.1-Sol), reviewed by orchestrator. Corrects the plan's
description of the Unassisted arm as a minimal-prompt condition.

Co-Authored-By: Claude Opus 5.5 <noreply@anthropic.com>
</commit_message>
<xml_diff>
--- a/analysis/output/manuscript/Table4.docx
+++ b/analysis/output/manuscript/Table4.docx
@@ -5605,7 +5605,7 @@
                 <w:szCs w:val="18"/>
                 <w:color w:val="000000"/>
               </w:rPr>
-              <w:t xml:space="preserve">[ref: This study] [j]</w:t>
+              <w:t xml:space="preserve">This study (ARBITER) [j]</w:t>
             </w:r>
           </w:p>
         </w:tc>
@@ -6115,7 +6115,7 @@
                 <w:szCs w:val="18"/>
                 <w:color w:val="000000"/>
               </w:rPr>
-              <w:t xml:space="preserve">Yes, documented; No, affirmative absence; NR, Not reported (presence or absence unclear). Partly means: code, spreadsheet or incomplete rules; enforcement, some configurations or incomplete answer checks; breaks, overall-only or qualitative checks; quotations, semantic judging without occurrence/integrity checks; audit, retained responses without a verifiable source bundle; agent, enabled browsing or retrieval without demonstrated agent tool calls; reference, limited re-review, historical independent teams or text-relevance review; registry/protocol, compressed or restricted delivery. Structured prompting alone is not enforced rules. Registry/protocol includes SAPs and available records; a registration number alone does not qualify. This study gave both compared arms identical inputs; other matched model/workflow comparisons also used identical underlying sources (see curated evidence notes). a, Compressed ancillary records; overall-only checks. b, Post hoc Excel derivation; six development trials. c, Prompt rules. d, RoB 2 cohort; protocols when available. e, Masked panel; actual browsing unmeasured. f, One trial, 38 runs. g, Retrieval and retained edits. h, Post hoc support judging. i, ROBINS-I; selected concordant references. j, Recorded overrides permitted; none in 510 domains; disputed-cell adjudication. k, RobotReviewer used RoB 1; its blinded panel judged text relevance. Reference callouts resolve in the manuscript bibliography. Full cell evidence and definitions: prior-work-comparison-notes.md.</w:t>
+              <w:t xml:space="preserve">Yes, documented; No, affirmative absence; NR, Not reported (presence or absence unclear). Partly means: code, spreadsheet or incomplete rules; enforcement, some configurations or incomplete answer checks; breaks, overall-only or qualitative checks; quotations, semantic judging without occurrence/integrity checks; audit, retained responses without a verifiable source bundle; agent, enabled browsing or retrieval without demonstrated agent tool calls; reference, limited re-review, historical independent teams or text-relevance review; registry/protocol, compressed or restricted delivery. Structured prompting alone is not enforced rules. Registry/protocol includes SAPs and available records; a registration number alone does not qualify. This study gave both compared arms identical inputs; other matched model/workflow comparisons also used identical underlying sources (see eTable 32). a, Compressed ancillary records; overall-only checks. b, Post hoc Excel derivation; six development trials. c, Prompt rules. d, RoB 2 cohort; protocols when available. e, Masked panel; actual browsing unmeasured. f, One trial, 38 runs. g, Retrieval and retained edits. h, Post hoc support judging. i, ROBINS-I; selected concordant references. j, Recorded overrides permitted; none in 510 domains; disputed-cell adjudication. k, RobotReviewer used RoB 1; its blinded panel judged text relevance. Reference callouts resolve in the manuscript bibliography. Condensed cell evidence and quotation locations: eTable 32.</w:t>
             </w:r>
           </w:p>
         </w:tc>

</xml_diff>